<commit_message>
Revisión final en vueltas: Gantt y recorrido del código
En el Gantt, la etiqueta de la fila de totales de «Cashflow» pasa a «Total» (se veía un 0 en Excel),
cambiado en el Google Sheet. En «Recorrido del código y herramientas», el guardado es en el momento
y el Nivel 2 distingue entre quedarse sin Wi-Fi y una consulta que falla. CAMBIOS_REVISION con las
tres vueltas; la tercera salió sin errores.

Co-Authored-By: Claude Opus 5.5 <noreply@anthropic.com>
Claude-Session: https://claude.ai/code/session_01QiY8ZZNAM9gwPKiqSkCaaj
</commit_message>
<xml_diff>
--- a/documentacion_proyecto/Recorrido_del_Codigo_y_Herramientas.docx
+++ b/documentacion_proyecto/Recorrido_del_Codigo_y_Herramientas.docx
@@ -1263,7 +1263,7 @@
           <w:sz w:val="21"/>
           <w:szCs w:val="21"/>
         </w:rPr>
-        <w:t xml:space="preserve"> dibuja la grilla: cada columna es una bobina de selección y cada fila una pasada, con su número de pasadas seguidas (×) y la columna ⇄ para los intercalados. El dibujo viaja al servidor como datos JSON: la matriz, las pasadas de cada fila, los colores y los grupos intercalados. Se guarda solo, a los pocos segundos de cada cambio.</w:t>
+        <w:t xml:space="preserve"> dibuja la grilla: cada columna es una bobina de selección y cada fila una pasada, con su número de pasadas seguidas (×) y la columna ⇄ para los intercalados. El dibujo viaja al servidor como datos JSON: la matriz, las pasadas de cada fila, los colores y los grupos intercalados. Cada cambio se guarda solo, en el momento; si todavía hay un guardado en camino, el siguiente espera a que termine.</w:t>
       </w:r>
     </w:p>
     <w:p>
@@ -3711,7 +3711,7 @@
           <w:sz w:val="21"/>
           <w:szCs w:val="21"/>
         </w:rPr>
-        <w:t xml:space="preserve"> lleva la misma cuenta que el servidor, así puede seguir aunque la red se corte un momento.</w:t>
+        <w:t xml:space="preserve"> lleva la misma cuenta que el servidor, así sigue con la fila que toca aunque una consulta al servidor falle, y después le reporta la cuenta.</w:t>
       </w:r>
     </w:p>
     <w:p>
@@ -3739,7 +3739,7 @@
           <w:sz w:val="21"/>
           <w:szCs w:val="21"/>
         </w:rPr>
-        <w:t xml:space="preserve"> Sin red no acciona nada: los relés quedan sueltos y la botonera sigue funcionando a mano. El watchdog reinicia la placa si algo se cuelga, los errores se guardan y se mandan cuando vuelve la red, y en solo sensado no pulsa ningún relé.</w:t>
+        <w:t xml:space="preserve"> Sin Wi-Fi no acciona nada: los relés quedan sueltos y la botonera sigue funcionando a mano. El watchdog reinicia la placa si algo se cuelga, los errores se guardan y se mandan cuando vuelve la red, y en solo sensado no pulsa ningún relé.</w:t>
       </w:r>
     </w:p>
     <w:p>

</xml_diff>